<commit_message>
Update planning docs: scope stablecoins to USDC+USD1, add time/cost estimates
- Security Audit Plan: expand into a phased Time & Cost Estimate table
  (readiness, remediation, tooling, pentest, SOC 2 Type I/II, vCISO) with
  4-9 month / ~$40k-150k+ summary
- Stablecoin Support Plan: rescope to USDC + USD1 via a single regulated
  partner (Zero Hash covers both); add Time & Cost Estimate table and
  ~4-8 month / ~$300k-1M+ summary vs ~$2M+/12-24mo self-licensing
</commit_message>
<xml_diff>
--- a/PayRails_Security_Audit_Plan.docx
+++ b/PayRails_Security_Audit_Plan.docx
@@ -949,23 +949,326 @@
         <w:pStyle w:val="Heading1"/>
       </w:pPr>
       <w:r>
-        <w:t>10. Indicative Timeline &amp; Cost</w:t>
+        <w:t>10. Time &amp; Cost Estimate</w:t>
       </w:r>
     </w:p>
     <w:p>
-      <w:pPr>
-        <w:pStyle w:val="ListBullet"/>
-      </w:pPr>
       <w:r>
-        <w:t>Timeline: 3–9 months to first SOC 2 Type II report (Type I interim in ~6–8 weeks).</w:t>
+        <w:t>Indicative ranges for a startup-scale platform, US market. Actuals depend on scope, headcount, and vendor selection. Figures are order-of-magnitude, not quotes.</w:t>
       </w:r>
     </w:p>
+    <w:tbl>
+      <w:tblPr>
+        <w:tblStyle w:val="TableGrid"/>
+        <w:tblW w:type="auto" w:w="0"/>
+        <w:tblLook w:firstColumn="1" w:firstRow="1" w:lastColumn="0" w:lastRow="0" w:noHBand="0" w:noVBand="1" w:val="04A0"/>
+      </w:tblPr>
+      <w:tblGrid>
+        <w:gridCol w:w="2880"/>
+        <w:gridCol w:w="2880"/>
+        <w:gridCol w:w="2880"/>
+      </w:tblGrid>
+      <w:tr>
+        <w:tc>
+          <w:tcPr>
+            <w:tcW w:type="dxa" w:w="2880"/>
+          </w:tcPr>
+          <w:p>
+            <w:r>
+              <w:rPr>
+                <w:b/>
+              </w:rPr>
+              <w:t>Phase / Item</w:t>
+            </w:r>
+          </w:p>
+        </w:tc>
+        <w:tc>
+          <w:tcPr>
+            <w:tcW w:type="dxa" w:w="2880"/>
+          </w:tcPr>
+          <w:p>
+            <w:r>
+              <w:rPr>
+                <w:b/>
+              </w:rPr>
+              <w:t>Duration</w:t>
+            </w:r>
+          </w:p>
+        </w:tc>
+        <w:tc>
+          <w:tcPr>
+            <w:tcW w:type="dxa" w:w="2880"/>
+          </w:tcPr>
+          <w:p>
+            <w:r>
+              <w:rPr>
+                <w:b/>
+              </w:rPr>
+              <w:t>Indicative cost (USD)</w:t>
+            </w:r>
+          </w:p>
+        </w:tc>
+      </w:tr>
+      <w:tr>
+        <w:tc>
+          <w:tcPr>
+            <w:tcW w:type="dxa" w:w="2880"/>
+          </w:tcPr>
+          <w:p>
+            <w:r>
+              <w:t>Readiness / gap assessment</w:t>
+            </w:r>
+          </w:p>
+        </w:tc>
+        <w:tc>
+          <w:tcPr>
+            <w:tcW w:type="dxa" w:w="2880"/>
+          </w:tcPr>
+          <w:p>
+            <w:r>
+              <w:t>3–5 weeks</w:t>
+            </w:r>
+          </w:p>
+        </w:tc>
+        <w:tc>
+          <w:tcPr>
+            <w:tcW w:type="dxa" w:w="2880"/>
+          </w:tcPr>
+          <w:p>
+            <w:r>
+              <w:t>$10k–$25k</w:t>
+            </w:r>
+          </w:p>
+        </w:tc>
+      </w:tr>
+      <w:tr>
+        <w:tc>
+          <w:tcPr>
+            <w:tcW w:type="dxa" w:w="2880"/>
+          </w:tcPr>
+          <w:p>
+            <w:r>
+              <w:t>Gap remediation (MFA, rate limiting, KMS, logging, dep pinning)</w:t>
+            </w:r>
+          </w:p>
+        </w:tc>
+        <w:tc>
+          <w:tcPr>
+            <w:tcW w:type="dxa" w:w="2880"/>
+          </w:tcPr>
+          <w:p>
+            <w:r>
+              <w:t>4–10 weeks (parallel)</w:t>
+            </w:r>
+          </w:p>
+        </w:tc>
+        <w:tc>
+          <w:tcPr>
+            <w:tcW w:type="dxa" w:w="2880"/>
+          </w:tcPr>
+          <w:p>
+            <w:r>
+              <w:t>Internal engineering effort</w:t>
+            </w:r>
+          </w:p>
+        </w:tc>
+      </w:tr>
+      <w:tr>
+        <w:tc>
+          <w:tcPr>
+            <w:tcW w:type="dxa" w:w="2880"/>
+          </w:tcPr>
+          <w:p>
+            <w:r>
+              <w:t>Compliance automation platform (Vanta/Drata/Secureframe)</w:t>
+            </w:r>
+          </w:p>
+        </w:tc>
+        <w:tc>
+          <w:tcPr>
+            <w:tcW w:type="dxa" w:w="2880"/>
+          </w:tcPr>
+          <w:p>
+            <w:r>
+              <w:t>Continuous</w:t>
+            </w:r>
+          </w:p>
+        </w:tc>
+        <w:tc>
+          <w:tcPr>
+            <w:tcW w:type="dxa" w:w="2880"/>
+          </w:tcPr>
+          <w:p>
+            <w:r>
+              <w:t>$8k–$25k / year</w:t>
+            </w:r>
+          </w:p>
+        </w:tc>
+      </w:tr>
+      <w:tr>
+        <w:tc>
+          <w:tcPr>
+            <w:tcW w:type="dxa" w:w="2880"/>
+          </w:tcPr>
+          <w:p>
+            <w:r>
+              <w:t>Third-party penetration test</w:t>
+            </w:r>
+          </w:p>
+        </w:tc>
+        <w:tc>
+          <w:tcPr>
+            <w:tcW w:type="dxa" w:w="2880"/>
+          </w:tcPr>
+          <w:p>
+            <w:r>
+              <w:t>2–4 weeks</w:t>
+            </w:r>
+          </w:p>
+        </w:tc>
+        <w:tc>
+          <w:tcPr>
+            <w:tcW w:type="dxa" w:w="2880"/>
+          </w:tcPr>
+          <w:p>
+            <w:r>
+              <w:t>$10k–$30k per test</w:t>
+            </w:r>
+          </w:p>
+        </w:tc>
+      </w:tr>
+      <w:tr>
+        <w:tc>
+          <w:tcPr>
+            <w:tcW w:type="dxa" w:w="2880"/>
+          </w:tcPr>
+          <w:p>
+            <w:r>
+              <w:t>SOC 2 Type I (interim report)</w:t>
+            </w:r>
+          </w:p>
+        </w:tc>
+        <w:tc>
+          <w:tcPr>
+            <w:tcW w:type="dxa" w:w="2880"/>
+          </w:tcPr>
+          <w:p>
+            <w:r>
+              <w:t>~6–8 weeks</w:t>
+            </w:r>
+          </w:p>
+        </w:tc>
+        <w:tc>
+          <w:tcPr>
+            <w:tcW w:type="dxa" w:w="2880"/>
+          </w:tcPr>
+          <w:p>
+            <w:r>
+              <w:t>$10k–$20k</w:t>
+            </w:r>
+          </w:p>
+        </w:tc>
+      </w:tr>
+      <w:tr>
+        <w:tc>
+          <w:tcPr>
+            <w:tcW w:type="dxa" w:w="2880"/>
+          </w:tcPr>
+          <w:p>
+            <w:r>
+              <w:t>SOC 2 Type II observation window</w:t>
+            </w:r>
+          </w:p>
+        </w:tc>
+        <w:tc>
+          <w:tcPr>
+            <w:tcW w:type="dxa" w:w="2880"/>
+          </w:tcPr>
+          <w:p>
+            <w:r>
+              <w:t>3–12 months</w:t>
+            </w:r>
+          </w:p>
+        </w:tc>
+        <w:tc>
+          <w:tcPr>
+            <w:tcW w:type="dxa" w:w="2880"/>
+          </w:tcPr>
+          <w:p>
+            <w:r>
+              <w:t>No direct cost</w:t>
+            </w:r>
+          </w:p>
+        </w:tc>
+      </w:tr>
+      <w:tr>
+        <w:tc>
+          <w:tcPr>
+            <w:tcW w:type="dxa" w:w="2880"/>
+          </w:tcPr>
+          <w:p>
+            <w:r>
+              <w:t>SOC 2 Type II audit (licensed CPA)</w:t>
+            </w:r>
+          </w:p>
+        </w:tc>
+        <w:tc>
+          <w:tcPr>
+            <w:tcW w:type="dxa" w:w="2880"/>
+          </w:tcPr>
+          <w:p>
+            <w:r>
+              <w:t>4–8 weeks</w:t>
+            </w:r>
+          </w:p>
+        </w:tc>
+        <w:tc>
+          <w:tcPr>
+            <w:tcW w:type="dxa" w:w="2880"/>
+          </w:tcPr>
+          <w:p>
+            <w:r>
+              <w:t>$20k–$60k</w:t>
+            </w:r>
+          </w:p>
+        </w:tc>
+      </w:tr>
+      <w:tr>
+        <w:tc>
+          <w:tcPr>
+            <w:tcW w:type="dxa" w:w="2880"/>
+          </w:tcPr>
+          <w:p>
+            <w:r>
+              <w:t>Optional vCISO / security lead</w:t>
+            </w:r>
+          </w:p>
+        </w:tc>
+        <w:tc>
+          <w:tcPr>
+            <w:tcW w:type="dxa" w:w="2880"/>
+          </w:tcPr>
+          <w:p>
+            <w:r>
+              <w:t>Ongoing</w:t>
+            </w:r>
+          </w:p>
+        </w:tc>
+        <w:tc>
+          <w:tcPr>
+            <w:tcW w:type="dxa" w:w="2880"/>
+          </w:tcPr>
+          <w:p>
+            <w:r>
+              <w:t>$5k–$15k / month</w:t>
+            </w:r>
+          </w:p>
+        </w:tc>
+      </w:tr>
+    </w:tbl>
     <w:p>
-      <w:pPr>
-        <w:pStyle w:val="ListBullet"/>
-      </w:pPr>
       <w:r>
-        <w:t>Cost envelope: ~$30k–$100k+ all-in (automation tooling + penetration test + CPA audit); higher with a vCISO.</w:t>
+        <w:t>Summary: first SOC 2 Type II report in roughly 4–9 months (a Type I interim in ~2–3 months). First-year all-in is commonly ~$40k–$150k+ (tooling + penetration test + audit; more with a vCISO). PCI-DSS, if the Card rail is in data scope, adds ~$30k–$100k+ for a full assessment — or only a short SAQ if card data is fully tokenized via the processor.</w:t>
       </w:r>
     </w:p>
     <w:p>

</xml_diff>